<commit_message>
1.0.14 VERSION C  Robust AI Pipelines Implemented; New Editor WIP
</commit_message>
<xml_diff>
--- a/Sisyphus/templates/cv_template_v_p.docx
+++ b/Sisyphus/templates/cv_template_v_p.docx
@@ -10,12 +10,9 @@
         <w:suppressAutoHyphens w:val="true"/>
         <w:bidi w:val="0"/>
         <w:spacing w:lineRule="auto" w:line="240" w:before="0" w:after="26"/>
-        <w:ind w:hanging="0" w:start="-720" w:end="-720"/>
+        <w:ind w:hanging="0" w:left="-720" w:right="-720"/>
         <w:jc w:val="center"/>
-        <w:rPr>
-          <w:sz w:val="24"/>
-          <w:szCs w:val="24"/>
-        </w:rPr>
+        <w:rPr/>
       </w:pPr>
       <w:r>
         <w:rPr>
@@ -34,10 +31,7 @@
         <w:bidi w:val="0"/>
         <w:spacing w:lineRule="auto" w:line="240" w:before="0" w:after="26"/>
         <w:jc w:val="center"/>
-        <w:rPr>
-          <w:sz w:val="20"/>
-          <w:szCs w:val="20"/>
-        </w:rPr>
+        <w:rPr/>
       </w:pPr>
       <w:r>
         <w:rPr>
@@ -54,10 +48,7 @@
         <w:bidi w:val="0"/>
         <w:spacing w:lineRule="auto" w:line="240" w:before="0" w:after="26"/>
         <w:jc w:val="center"/>
-        <w:rPr>
-          <w:sz w:val="20"/>
-          <w:szCs w:val="20"/>
-        </w:rPr>
+        <w:rPr/>
       </w:pPr>
       <w:r>
         <w:rPr>
@@ -71,14 +62,14 @@
     <w:tbl>
       <w:tblPr>
         <w:tblW w:w="11880" w:type="dxa"/>
-        <w:jc w:val="start"/>
+        <w:jc w:val="left"/>
         <w:tblInd w:w="-954" w:type="dxa"/>
         <w:tblLayout w:type="fixed"/>
         <w:tblCellMar>
           <w:top w:w="55" w:type="dxa"/>
-          <w:start w:w="55" w:type="dxa"/>
+          <w:left w:w="55" w:type="dxa"/>
           <w:bottom w:w="55" w:type="dxa"/>
-          <w:end w:w="55" w:type="dxa"/>
+          <w:right w:w="55" w:type="dxa"/>
         </w:tblCellMar>
       </w:tblPr>
       <w:tblGrid>
@@ -99,11 +90,8 @@
               <w:pStyle w:val="BodyText"/>
               <w:bidi w:val="0"/>
               <w:spacing w:lineRule="auto" w:line="240" w:before="57" w:after="57"/>
-              <w:jc w:val="start"/>
-              <w:rPr>
-                <w:sz w:val="20"/>
-                <w:szCs w:val="20"/>
-              </w:rPr>
+              <w:jc w:val="left"/>
+              <w:rPr/>
             </w:pPr>
             <w:r>
               <w:rPr>
@@ -163,12 +151,9 @@
               <w:suppressAutoHyphens w:val="true"/>
               <w:bidi w:val="0"/>
               <w:spacing w:lineRule="auto" w:line="240" w:before="57" w:after="57"/>
-              <w:ind w:hanging="0" w:start="0" w:end="0"/>
+              <w:ind w:hanging="0" w:left="0" w:right="0"/>
               <w:jc w:val="both"/>
-              <w:rPr>
-                <w:sz w:val="20"/>
-                <w:szCs w:val="20"/>
-              </w:rPr>
+              <w:rPr/>
             </w:pPr>
             <w:r>
               <w:rPr>
@@ -211,157 +196,369 @@
               <w:pStyle w:val="BodyText"/>
               <w:bidi w:val="0"/>
               <w:spacing w:lineRule="auto" w:line="240" w:before="57" w:after="57"/>
-              <w:ind w:hanging="0" w:start="0" w:end="0"/>
-              <w:jc w:val="end"/>
-              <w:rPr>
+              <w:ind w:hanging="0" w:left="0" w:right="0"/>
+              <w:jc w:val="right"/>
+              <w:rPr/>
+            </w:pPr>
+            <w:r>
+              <w:rPr>
+                <w:rFonts w:ascii="Times New Roman" w:hAnsi="Times New Roman"/>
+                <w:b/>
+                <w:bCs/>
                 <w:sz w:val="24"/>
                 <w:szCs w:val="24"/>
               </w:rPr>
-            </w:pPr>
-            <w:r>
-              <w:rPr>
-                <w:rFonts w:ascii="Times New Roman" w:hAnsi="Times New Roman"/>
-                <w:b/>
-                <w:bCs/>
+              <w:t>Skills</w:t>
+            </w:r>
+          </w:p>
+          <w:p>
+            <w:pPr>
+              <w:pStyle w:val="BodyText"/>
+              <w:bidi w:val="0"/>
+              <w:spacing w:lineRule="auto" w:line="240" w:before="57" w:after="57"/>
+              <w:ind w:hanging="0" w:left="0" w:right="0"/>
+              <w:jc w:val="right"/>
+              <w:rPr/>
+            </w:pPr>
+            <w:r>
+              <w:rPr>
+                <w:rFonts w:ascii="Times New Roman" w:hAnsi="Times New Roman"/>
+                <w:b/>
+                <w:bCs/>
+                <w:sz w:val="20"/>
+                <w:szCs w:val="20"/>
+              </w:rPr>
+              <w:t>Programming Languages</w:t>
+            </w:r>
+          </w:p>
+          <w:p>
+            <w:pPr>
+              <w:pStyle w:val="BodyText"/>
+              <w:bidi w:val="0"/>
+              <w:spacing w:lineRule="auto" w:line="240" w:before="57" w:after="57"/>
+              <w:jc w:val="right"/>
+              <w:rPr/>
+            </w:pPr>
+            <w:r>
+              <w:rPr>
+                <w:rFonts w:ascii="Times New Roman" w:hAnsi="Times New Roman"/>
+                <w:sz w:val="18"/>
+                <w:szCs w:val="18"/>
+              </w:rPr>
+              <w:t>{{ skills.programming_languages | join(', ') }}</w:t>
+            </w:r>
+          </w:p>
+          <w:p>
+            <w:pPr>
+              <w:pStyle w:val="BodyText"/>
+              <w:bidi w:val="0"/>
+              <w:spacing w:lineRule="auto" w:line="240" w:before="57" w:after="57"/>
+              <w:jc w:val="right"/>
+              <w:rPr/>
+            </w:pPr>
+            <w:r>
+              <w:rPr>
+                <w:rFonts w:ascii="Times New Roman" w:hAnsi="Times New Roman"/>
+                <w:b/>
+                <w:bCs/>
+                <w:sz w:val="20"/>
+                <w:szCs w:val="20"/>
+              </w:rPr>
+              <w:t>Technical</w:t>
+            </w:r>
+          </w:p>
+          <w:p>
+            <w:pPr>
+              <w:pStyle w:val="BodyText"/>
+              <w:bidi w:val="0"/>
+              <w:spacing w:lineRule="auto" w:line="240" w:before="57" w:after="57"/>
+              <w:jc w:val="right"/>
+              <w:rPr/>
+            </w:pPr>
+            <w:r>
+              <w:rPr>
+                <w:rFonts w:ascii="Times New Roman" w:hAnsi="Times New Roman"/>
+                <w:sz w:val="18"/>
+                <w:szCs w:val="18"/>
+              </w:rPr>
+              <w:t>{{ skills.technical_skills | join(', ') }}</w:t>
+            </w:r>
+          </w:p>
+          <w:p>
+            <w:pPr>
+              <w:pStyle w:val="BodyText"/>
+              <w:bidi w:val="0"/>
+              <w:spacing w:lineRule="auto" w:line="240" w:before="57" w:after="57"/>
+              <w:jc w:val="right"/>
+              <w:rPr/>
+            </w:pPr>
+            <w:r>
+              <w:rPr>
+                <w:rFonts w:ascii="Times New Roman" w:hAnsi="Times New Roman"/>
+                <w:b/>
+                <w:bCs/>
+                <w:sz w:val="20"/>
+                <w:szCs w:val="20"/>
+              </w:rPr>
+              <w:t>Soft</w:t>
+            </w:r>
+          </w:p>
+          <w:p>
+            <w:pPr>
+              <w:pStyle w:val="BodyText"/>
+              <w:bidi w:val="0"/>
+              <w:spacing w:lineRule="auto" w:line="240" w:before="57" w:after="57"/>
+              <w:jc w:val="right"/>
+              <w:rPr/>
+            </w:pPr>
+            <w:r>
+              <w:rPr>
+                <w:rFonts w:ascii="Times New Roman" w:hAnsi="Times New Roman"/>
+                <w:sz w:val="18"/>
+                <w:szCs w:val="18"/>
+              </w:rPr>
+              <w:t>{{ skills.soft_skills | join(', ') }</w:t>
+            </w:r>
+            <w:r>
+              <w:rPr>
+                <w:rFonts w:ascii="Times New Roman" w:hAnsi="Times New Roman"/>
+                <w:sz w:val="20"/>
+                <w:szCs w:val="20"/>
+              </w:rPr>
+              <w:t>}</w:t>
+            </w:r>
+          </w:p>
+        </w:tc>
+      </w:tr>
+      <w:tr>
+        <w:trPr>
+          <w:trHeight w:val="690" w:hRule="atLeast"/>
+        </w:trPr>
+        <w:tc>
+          <w:tcPr>
+            <w:tcW w:w="9149" w:type="dxa"/>
+            <w:tcBorders/>
+          </w:tcPr>
+          <w:p>
+            <w:pPr>
+              <w:pStyle w:val="BodyText"/>
+              <w:bidi w:val="0"/>
+              <w:spacing w:lineRule="auto" w:line="240" w:before="57" w:after="57"/>
+              <w:jc w:val="left"/>
+              <w:rPr/>
+            </w:pPr>
+            <w:r>
+              <w:rPr>
+                <w:rStyle w:val="Strong"/>
+                <w:rFonts w:ascii="Times New Roman" w:hAnsi="Times New Roman"/>
                 <w:sz w:val="24"/>
                 <w:szCs w:val="24"/>
               </w:rPr>
-              <w:t>Skills</w:t>
-            </w:r>
-          </w:p>
-          <w:p>
-            <w:pPr>
-              <w:pStyle w:val="BodyText"/>
-              <w:bidi w:val="0"/>
-              <w:spacing w:lineRule="auto" w:line="240" w:before="57" w:after="57"/>
-              <w:ind w:hanging="0" w:start="0" w:end="0"/>
-              <w:jc w:val="end"/>
-              <w:rPr>
-                <w:sz w:val="20"/>
-                <w:szCs w:val="20"/>
-              </w:rPr>
-            </w:pPr>
-            <w:r>
-              <w:rPr>
-                <w:rFonts w:ascii="Times New Roman" w:hAnsi="Times New Roman"/>
-                <w:b/>
-                <w:bCs/>
-                <w:sz w:val="20"/>
-                <w:szCs w:val="20"/>
-              </w:rPr>
-              <w:t>Programming Languages</w:t>
-            </w:r>
-          </w:p>
-          <w:p>
-            <w:pPr>
-              <w:pStyle w:val="BodyText"/>
-              <w:bidi w:val="0"/>
-              <w:spacing w:lineRule="auto" w:line="240" w:before="57" w:after="57"/>
-              <w:jc w:val="end"/>
-              <w:rPr>
-                <w:sz w:val="18"/>
-                <w:szCs w:val="18"/>
-              </w:rPr>
-            </w:pPr>
-            <w:r>
-              <w:rPr>
-                <w:rFonts w:ascii="Times New Roman" w:hAnsi="Times New Roman"/>
-                <w:sz w:val="18"/>
-                <w:szCs w:val="18"/>
-              </w:rPr>
-              <w:t>{{ skills.programming_languages | join(', ') }}</w:t>
-            </w:r>
-          </w:p>
-          <w:p>
-            <w:pPr>
-              <w:pStyle w:val="BodyText"/>
-              <w:bidi w:val="0"/>
-              <w:spacing w:lineRule="auto" w:line="240" w:before="57" w:after="57"/>
-              <w:jc w:val="end"/>
-              <w:rPr>
-                <w:sz w:val="20"/>
-                <w:szCs w:val="20"/>
-              </w:rPr>
-            </w:pPr>
-            <w:r>
-              <w:rPr>
-                <w:rFonts w:ascii="Times New Roman" w:hAnsi="Times New Roman"/>
-                <w:b/>
-                <w:bCs/>
-                <w:sz w:val="20"/>
-                <w:szCs w:val="20"/>
-              </w:rPr>
-              <w:t>Technical</w:t>
-            </w:r>
-          </w:p>
-          <w:p>
-            <w:pPr>
-              <w:pStyle w:val="BodyText"/>
-              <w:bidi w:val="0"/>
-              <w:spacing w:lineRule="auto" w:line="240" w:before="57" w:after="57"/>
-              <w:jc w:val="end"/>
-              <w:rPr>
-                <w:sz w:val="18"/>
-                <w:szCs w:val="18"/>
-              </w:rPr>
-            </w:pPr>
-            <w:r>
-              <w:rPr>
-                <w:rFonts w:ascii="Times New Roman" w:hAnsi="Times New Roman"/>
-                <w:sz w:val="18"/>
-                <w:szCs w:val="18"/>
-              </w:rPr>
-              <w:t>{{ skills.technical_skills | join(', ') }}</w:t>
-            </w:r>
-          </w:p>
-          <w:p>
-            <w:pPr>
-              <w:pStyle w:val="BodyText"/>
-              <w:bidi w:val="0"/>
-              <w:spacing w:lineRule="auto" w:line="240" w:before="57" w:after="57"/>
-              <w:jc w:val="end"/>
-              <w:rPr>
-                <w:sz w:val="20"/>
-                <w:szCs w:val="20"/>
-              </w:rPr>
-            </w:pPr>
-            <w:r>
-              <w:rPr>
-                <w:rFonts w:ascii="Times New Roman" w:hAnsi="Times New Roman"/>
-                <w:b/>
-                <w:bCs/>
-                <w:sz w:val="20"/>
-                <w:szCs w:val="20"/>
-              </w:rPr>
-              <w:t>Soft</w:t>
-            </w:r>
-          </w:p>
-          <w:p>
-            <w:pPr>
-              <w:pStyle w:val="BodyText"/>
-              <w:bidi w:val="0"/>
-              <w:spacing w:lineRule="auto" w:line="240" w:before="57" w:after="57"/>
-              <w:jc w:val="end"/>
-              <w:rPr>
-                <w:sz w:val="20"/>
-                <w:szCs w:val="20"/>
-              </w:rPr>
-            </w:pPr>
-            <w:r>
-              <w:rPr>
-                <w:rFonts w:ascii="Times New Roman" w:hAnsi="Times New Roman"/>
-                <w:sz w:val="18"/>
-                <w:szCs w:val="18"/>
-              </w:rPr>
-              <w:t>{{ skills.soft_skills | join(', ') }</w:t>
-            </w:r>
-            <w:r>
-              <w:rPr>
-                <w:rFonts w:ascii="Times New Roman" w:hAnsi="Times New Roman"/>
-                <w:sz w:val="20"/>
-                <w:szCs w:val="20"/>
-              </w:rPr>
-              <w:t>}</w:t>
+              <w:t>Education</w:t>
+            </w:r>
+            <w:r>
+              <w:rPr>
+                <w:rFonts w:ascii="Times New Roman" w:hAnsi="Times New Roman"/>
+                <w:sz w:val="20"/>
+                <w:szCs w:val="20"/>
+              </w:rPr>
+              <w:t> </w:t>
+            </w:r>
+            <w:r>
+              <w:rPr>
+                <w:rFonts w:ascii="Times New Roman" w:hAnsi="Times New Roman"/>
+                <w:sz w:val="18"/>
+                <w:szCs w:val="18"/>
+              </w:rPr>
+              <w:t>{% for edu in education %}</w:t>
+            </w:r>
+          </w:p>
+          <w:p>
+            <w:pPr>
+              <w:pStyle w:val="BodyText"/>
+              <w:bidi w:val="0"/>
+              <w:spacing w:lineRule="auto" w:line="240" w:before="57" w:after="57"/>
+              <w:jc w:val="left"/>
+              <w:rPr/>
+            </w:pPr>
+            <w:r>
+              <w:rPr>
+                <w:rFonts w:ascii="Times New Roman" w:hAnsi="Times New Roman"/>
+                <w:b/>
+                <w:bCs/>
+                <w:sz w:val="20"/>
+                <w:szCs w:val="20"/>
+              </w:rPr>
+              <w:t>{{ edu.degree }}</w:t>
+            </w:r>
+            <w:r>
+              <w:rPr>
+                <w:rFonts w:ascii="Times New Roman" w:hAnsi="Times New Roman"/>
+                <w:b/>
+                <w:bCs/>
+                <w:sz w:val="18"/>
+                <w:szCs w:val="18"/>
+              </w:rPr>
+              <w:t xml:space="preserve"> </w:t>
+            </w:r>
+            <w:r>
+              <w:rPr>
+                <w:rFonts w:ascii="Times New Roman" w:hAnsi="Times New Roman"/>
+                <w:sz w:val="18"/>
+                <w:szCs w:val="18"/>
+              </w:rPr>
+              <w:t xml:space="preserve">| {{ edu.university }} | {{ edu.location }} | {{ edu.duration }} </w:t>
+            </w:r>
+          </w:p>
+          <w:p>
+            <w:pPr>
+              <w:pStyle w:val="BodyText"/>
+              <w:bidi w:val="0"/>
+              <w:spacing w:lineRule="auto" w:line="240" w:before="57" w:after="57"/>
+              <w:jc w:val="left"/>
+              <w:rPr/>
+            </w:pPr>
+            <w:r>
+              <w:rPr>
+                <w:rFonts w:ascii="Times New Roman" w:hAnsi="Times New Roman"/>
+                <w:sz w:val="18"/>
+                <w:szCs w:val="18"/>
+              </w:rPr>
+              <w:t>Courses: {{ edu.courses | join(', ') }} {% endfor %}</w:t>
+            </w:r>
+          </w:p>
+        </w:tc>
+        <w:tc>
+          <w:tcPr>
+            <w:tcW w:w="2730" w:type="dxa"/>
+            <w:vMerge w:val="continue"/>
+            <w:tcBorders/>
+          </w:tcPr>
+          <w:p>
+            <w:pPr>
+              <w:pStyle w:val="BodyText"/>
+              <w:bidi w:val="0"/>
+              <w:spacing w:lineRule="auto" w:line="240" w:before="57" w:after="57"/>
+              <w:ind w:hanging="0" w:left="0" w:right="0"/>
+              <w:jc w:val="right"/>
+              <w:rPr>
+                <w:sz w:val="24"/>
+                <w:szCs w:val="24"/>
+              </w:rPr>
+            </w:pPr>
+            <w:r>
+              <w:rPr>
+                <w:sz w:val="24"/>
+                <w:szCs w:val="24"/>
+              </w:rPr>
+            </w:r>
+          </w:p>
+        </w:tc>
+      </w:tr>
+      <w:tr>
+        <w:trPr>
+          <w:trHeight w:val="690" w:hRule="atLeast"/>
+        </w:trPr>
+        <w:tc>
+          <w:tcPr>
+            <w:tcW w:w="9149" w:type="dxa"/>
+            <w:tcBorders/>
+          </w:tcPr>
+          <w:p>
+            <w:pPr>
+              <w:pStyle w:val="BodyText"/>
+              <w:bidi w:val="0"/>
+              <w:spacing w:lineRule="auto" w:line="240" w:before="57" w:after="57"/>
+              <w:jc w:val="left"/>
+              <w:rPr/>
+            </w:pPr>
+            <w:r>
+              <w:rPr>
+                <w:rStyle w:val="Strong"/>
+                <w:rFonts w:ascii="Times New Roman" w:hAnsi="Times New Roman"/>
+                <w:sz w:val="24"/>
+                <w:szCs w:val="24"/>
+              </w:rPr>
+              <w:t>Certifications</w:t>
+            </w:r>
+            <w:r>
+              <w:rPr>
+                <w:rFonts w:ascii="Times New Roman" w:hAnsi="Times New Roman"/>
+                <w:sz w:val="24"/>
+                <w:szCs w:val="24"/>
+              </w:rPr>
+              <w:t> </w:t>
+            </w:r>
+            <w:r>
+              <w:rPr>
+                <w:rFonts w:ascii="Times New Roman" w:hAnsi="Times New Roman"/>
+                <w:sz w:val="18"/>
+                <w:szCs w:val="18"/>
+              </w:rPr>
+              <w:t>{% for cert in certifications %}</w:t>
+            </w:r>
+          </w:p>
+          <w:p>
+            <w:pPr>
+              <w:pStyle w:val="BodyText"/>
+              <w:bidi w:val="0"/>
+              <w:spacing w:lineRule="auto" w:line="240" w:before="57" w:after="57"/>
+              <w:jc w:val="left"/>
+              <w:rPr/>
+            </w:pPr>
+            <w:r>
+              <w:rPr>
+                <w:rFonts w:ascii="Times New Roman" w:hAnsi="Times New Roman"/>
+                <w:b/>
+                <w:bCs/>
+                <w:sz w:val="20"/>
+                <w:szCs w:val="20"/>
+              </w:rPr>
+              <w:t>{{ cert.certification_name }}</w:t>
+            </w:r>
+            <w:r>
+              <w:rPr>
+                <w:rFonts w:ascii="Times New Roman" w:hAnsi="Times New Roman"/>
+                <w:b/>
+                <w:bCs/>
+                <w:sz w:val="20"/>
+                <w:szCs w:val="20"/>
+              </w:rPr>
+              <w:t xml:space="preserve"> </w:t>
+            </w:r>
+            <w:r>
+              <w:rPr>
+                <w:rFonts w:ascii="Times New Roman" w:hAnsi="Times New Roman"/>
+                <w:sz w:val="18"/>
+                <w:szCs w:val="18"/>
+              </w:rPr>
+              <w:t>{{ cert.issuing_organization }} | {{ cert.issue_date }} {% endfor %}</w:t>
+            </w:r>
+          </w:p>
+        </w:tc>
+        <w:tc>
+          <w:tcPr>
+            <w:tcW w:w="2730" w:type="dxa"/>
+            <w:vMerge w:val="continue"/>
+            <w:tcBorders/>
+          </w:tcPr>
+          <w:p>
+            <w:pPr>
+              <w:pStyle w:val="BodyText"/>
+              <w:bidi w:val="0"/>
+              <w:spacing w:lineRule="auto" w:line="240" w:before="57" w:after="57"/>
+              <w:ind w:hanging="0" w:left="0" w:right="0"/>
+              <w:jc w:val="right"/>
+              <w:rPr>
+                <w:sz w:val="24"/>
+                <w:szCs w:val="24"/>
+              </w:rPr>
+            </w:pPr>
+            <w:r>
+              <w:rPr>
+                <w:sz w:val="24"/>
+                <w:szCs w:val="24"/>
+              </w:rPr>
             </w:r>
           </w:p>
         </w:tc>
@@ -378,7 +575,8 @@
               <w:pStyle w:val="BodyText"/>
               <w:bidi w:val="0"/>
               <w:spacing w:lineRule="auto" w:line="240" w:before="57" w:after="57"/>
-              <w:jc w:val="start"/>
+              <w:ind w:hanging="0" w:left="0" w:right="0"/>
+              <w:jc w:val="left"/>
               <w:rPr/>
             </w:pPr>
             <w:r>
@@ -388,7 +586,7 @@
                 <w:sz w:val="24"/>
                 <w:szCs w:val="24"/>
               </w:rPr>
-              <w:t>Education</w:t>
+              <w:t>Awards and Scholarships</w:t>
             </w:r>
             <w:r>
               <w:rPr>
@@ -404,175 +602,6 @@
                 <w:sz w:val="18"/>
                 <w:szCs w:val="18"/>
               </w:rPr>
-              <w:t>{% for edu in education %}</w:t>
-            </w:r>
-          </w:p>
-          <w:p>
-            <w:pPr>
-              <w:pStyle w:val="BodyText"/>
-              <w:bidi w:val="0"/>
-              <w:spacing w:lineRule="auto" w:line="240" w:before="57" w:after="57"/>
-              <w:jc w:val="start"/>
-              <w:rPr>
-                <w:sz w:val="18"/>
-                <w:szCs w:val="18"/>
-              </w:rPr>
-            </w:pPr>
-            <w:r>
-              <w:rPr>
-                <w:rFonts w:ascii="Times New Roman" w:hAnsi="Times New Roman"/>
-                <w:b/>
-                <w:bCs/>
-                <w:sz w:val="20"/>
-                <w:szCs w:val="20"/>
-              </w:rPr>
-              <w:t>{{ edu.degree }}</w:t>
-            </w:r>
-            <w:r>
-              <w:rPr>
-                <w:rFonts w:ascii="Times New Roman" w:hAnsi="Times New Roman"/>
-                <w:b/>
-                <w:bCs/>
-                <w:sz w:val="18"/>
-                <w:szCs w:val="18"/>
-              </w:rPr>
-              <w:t xml:space="preserve"> </w:t>
-            </w:r>
-            <w:r>
-              <w:rPr>
-                <w:rFonts w:ascii="Times New Roman" w:hAnsi="Times New Roman"/>
-                <w:sz w:val="18"/>
-                <w:szCs w:val="18"/>
-              </w:rPr>
-              <w:t xml:space="preserve">| {{ edu.university }} | {{ edu.location }} | {{ edu.duration }} </w:t>
-            </w:r>
-          </w:p>
-          <w:p>
-            <w:pPr>
-              <w:pStyle w:val="BodyText"/>
-              <w:bidi w:val="0"/>
-              <w:spacing w:lineRule="auto" w:line="240" w:before="57" w:after="57"/>
-              <w:jc w:val="start"/>
-              <w:rPr>
-                <w:sz w:val="18"/>
-                <w:szCs w:val="18"/>
-              </w:rPr>
-            </w:pPr>
-            <w:r>
-              <w:rPr>
-                <w:rFonts w:ascii="Times New Roman" w:hAnsi="Times New Roman"/>
-                <w:sz w:val="18"/>
-                <w:szCs w:val="18"/>
-              </w:rPr>
-              <w:t>Courses: {{ edu.courses | join(', ') }} {% endfor %}</w:t>
-            </w:r>
-          </w:p>
-          <w:p>
-            <w:pPr>
-              <w:pStyle w:val="BodyText"/>
-              <w:bidi w:val="0"/>
-              <w:spacing w:lineRule="auto" w:line="240" w:before="57" w:after="57"/>
-              <w:jc w:val="start"/>
-              <w:rPr/>
-            </w:pPr>
-            <w:r>
-              <w:rPr>
-                <w:rStyle w:val="Strong"/>
-                <w:rFonts w:ascii="Times New Roman" w:hAnsi="Times New Roman"/>
-                <w:sz w:val="24"/>
-                <w:szCs w:val="24"/>
-              </w:rPr>
-              <w:t>Certifications</w:t>
-            </w:r>
-            <w:r>
-              <w:rPr>
-                <w:rFonts w:ascii="Times New Roman" w:hAnsi="Times New Roman"/>
-                <w:sz w:val="24"/>
-                <w:szCs w:val="24"/>
-              </w:rPr>
-              <w:t> </w:t>
-            </w:r>
-            <w:r>
-              <w:rPr>
-                <w:rFonts w:ascii="Times New Roman" w:hAnsi="Times New Roman"/>
-                <w:sz w:val="18"/>
-                <w:szCs w:val="18"/>
-              </w:rPr>
-              <w:t>{% for cert in certifications %}</w:t>
-            </w:r>
-          </w:p>
-          <w:p>
-            <w:pPr>
-              <w:pStyle w:val="BodyText"/>
-              <w:bidi w:val="0"/>
-              <w:spacing w:lineRule="auto" w:line="240" w:before="57" w:after="57"/>
-              <w:jc w:val="start"/>
-              <w:rPr>
-                <w:sz w:val="18"/>
-                <w:szCs w:val="18"/>
-              </w:rPr>
-            </w:pPr>
-            <w:r>
-              <w:rPr>
-                <w:rFonts w:ascii="Times New Roman" w:hAnsi="Times New Roman"/>
-                <w:b/>
-                <w:bCs/>
-                <w:sz w:val="20"/>
-                <w:szCs w:val="20"/>
-              </w:rPr>
-              <w:t>{{ cert.certification_name }}</w:t>
-            </w:r>
-            <w:r>
-              <w:rPr>
-                <w:rFonts w:ascii="Times New Roman" w:hAnsi="Times New Roman"/>
-                <w:b/>
-                <w:bCs/>
-                <w:sz w:val="18"/>
-                <w:szCs w:val="18"/>
-              </w:rPr>
-              <w:t xml:space="preserve"> </w:t>
-            </w:r>
-            <w:r>
-              <w:rPr>
-                <w:rFonts w:ascii="Times New Roman" w:hAnsi="Times New Roman"/>
-                <w:sz w:val="18"/>
-                <w:szCs w:val="18"/>
-              </w:rPr>
-              <w:t>{{ cert.issuing_organization }} | {{ cert.issue_date }} {% endfor %}</w:t>
-            </w:r>
-          </w:p>
-          <w:p>
-            <w:pPr>
-              <w:pStyle w:val="BodyText"/>
-              <w:bidi w:val="0"/>
-              <w:spacing w:lineRule="auto" w:line="240" w:before="57" w:after="57"/>
-              <w:ind w:hanging="0" w:start="0" w:end="0"/>
-              <w:jc w:val="start"/>
-              <w:rPr/>
-            </w:pPr>
-            <w:r>
-              <w:rPr>
-                <w:rStyle w:val="Strong"/>
-                <w:rFonts w:ascii="Times New Roman" w:hAnsi="Times New Roman"/>
-                <w:sz w:val="24"/>
-                <w:szCs w:val="24"/>
-              </w:rPr>
-              <w:t>Awards and Scholarships</w:t>
-            </w:r>
-            <w:r>
-              <w:rPr>
-                <w:rFonts w:ascii="Times New Roman" w:hAnsi="Times New Roman"/>
-                <w:sz w:val="20"/>
-                <w:szCs w:val="20"/>
-              </w:rPr>
-              <w:t> </w:t>
-            </w:r>
-            <w:r>
-              <w:rPr>
-                <w:rFonts w:ascii="Times New Roman" w:hAnsi="Times New Roman"/>
-                <w:sz w:val="18"/>
-                <w:szCs w:val="18"/>
-              </w:rPr>
               <w:t>{% for award in awards_and_scholarships %}</w:t>
             </w:r>
           </w:p>
@@ -581,12 +610,9 @@
               <w:pStyle w:val="BodyText"/>
               <w:bidi w:val="0"/>
               <w:spacing w:lineRule="auto" w:line="240" w:before="57" w:after="57"/>
-              <w:ind w:hanging="0" w:start="0" w:end="0"/>
-              <w:jc w:val="start"/>
-              <w:rPr>
-                <w:sz w:val="18"/>
-                <w:szCs w:val="18"/>
-              </w:rPr>
+              <w:ind w:hanging="0" w:left="0" w:right="0"/>
+              <w:jc w:val="left"/>
+              <w:rPr/>
             </w:pPr>
             <w:r>
               <w:rPr>
@@ -619,7 +645,7 @@
               <w:pStyle w:val="BodyText"/>
               <w:bidi w:val="0"/>
               <w:spacing w:lineRule="auto" w:line="240" w:before="57" w:after="57"/>
-              <w:jc w:val="end"/>
+              <w:jc w:val="right"/>
               <w:rPr>
                 <w:rFonts w:ascii="Times New Roman" w:hAnsi="Times New Roman"/>
                 <w:sz w:val="20"/>
@@ -649,7 +675,7 @@
               <w:pStyle w:val="BodyText"/>
               <w:bidi w:val="0"/>
               <w:spacing w:lineRule="auto" w:line="240" w:before="57" w:after="57"/>
-              <w:jc w:val="start"/>
+              <w:jc w:val="left"/>
               <w:rPr/>
             </w:pPr>
             <w:r>
@@ -683,11 +709,8 @@
               <w:pStyle w:val="BodyText"/>
               <w:bidi w:val="0"/>
               <w:spacing w:lineRule="auto" w:line="240" w:before="57" w:after="57"/>
-              <w:jc w:val="start"/>
-              <w:rPr>
-                <w:sz w:val="18"/>
-                <w:szCs w:val="18"/>
-              </w:rPr>
+              <w:jc w:val="both"/>
+              <w:rPr/>
             </w:pPr>
             <w:r>
               <w:rPr>
@@ -718,10 +741,7 @@
               <w:bidi w:val="0"/>
               <w:spacing w:lineRule="auto" w:line="240" w:before="57" w:after="57"/>
               <w:jc w:val="both"/>
-              <w:rPr>
-                <w:sz w:val="18"/>
-                <w:szCs w:val="18"/>
-              </w:rPr>
+              <w:rPr/>
             </w:pPr>
             <w:r>
               <w:rPr>
@@ -736,7 +756,7 @@
       </w:tr>
       <w:tr>
         <w:trPr>
-          <w:trHeight w:val="1104" w:hRule="atLeast"/>
+          <w:trHeight w:val="1129" w:hRule="atLeast"/>
         </w:trPr>
         <w:tc>
           <w:tcPr>
@@ -749,7 +769,7 @@
               <w:pStyle w:val="BodyText"/>
               <w:bidi w:val="0"/>
               <w:spacing w:lineRule="auto" w:line="240" w:before="57" w:after="57"/>
-              <w:jc w:val="start"/>
+              <w:jc w:val="left"/>
               <w:rPr/>
             </w:pPr>
             <w:r>
@@ -783,11 +803,8 @@
               <w:pStyle w:val="BodyText"/>
               <w:bidi w:val="0"/>
               <w:spacing w:lineRule="auto" w:line="240" w:before="57" w:after="57"/>
-              <w:jc w:val="start"/>
-              <w:rPr>
-                <w:sz w:val="18"/>
-                <w:szCs w:val="18"/>
-              </w:rPr>
+              <w:jc w:val="both"/>
+              <w:rPr/>
             </w:pPr>
             <w:r>
               <w:rPr>
@@ -813,11 +830,8 @@
               <w:pStyle w:val="BodyText"/>
               <w:bidi w:val="0"/>
               <w:spacing w:lineRule="auto" w:line="240" w:before="57" w:after="57"/>
-              <w:jc w:val="start"/>
-              <w:rPr>
-                <w:sz w:val="18"/>
-                <w:szCs w:val="18"/>
-              </w:rPr>
+              <w:jc w:val="both"/>
+              <w:rPr/>
             </w:pPr>
             <w:r>
               <w:rPr>
@@ -838,10 +852,7 @@
               <w:bidi w:val="0"/>
               <w:spacing w:lineRule="auto" w:line="240" w:before="57" w:after="57"/>
               <w:jc w:val="both"/>
-              <w:rPr>
-                <w:sz w:val="18"/>
-                <w:szCs w:val="18"/>
-              </w:rPr>
+              <w:rPr/>
             </w:pPr>
             <w:r>
               <w:rPr>
@@ -862,8 +873,8 @@
         <w:suppressAutoHyphens w:val="true"/>
         <w:bidi w:val="0"/>
         <w:spacing w:lineRule="auto" w:line="240" w:before="0" w:after="83"/>
-        <w:ind w:firstLine="5940" w:start="-809" w:end="-720"/>
-        <w:jc w:val="start"/>
+        <w:ind w:firstLine="5940" w:left="-809" w:right="-720"/>
+        <w:jc w:val="left"/>
         <w:rPr>
           <w:rFonts w:ascii="Times New Roman" w:hAnsi="Times New Roman"/>
           <w:sz w:val="20"/>
@@ -899,12 +910,12 @@
       <w:numFmt w:val="bullet"/>
       <w:suff w:val="space"/>
       <w:lvlText w:val="-"/>
-      <w:lvlJc w:val="start"/>
+      <w:lvlJc w:val="left"/>
       <w:pPr>
         <w:tabs>
           <w:tab w:val="num" w:pos="0"/>
         </w:tabs>
-        <w:ind w:start="432" w:hanging="360"/>
+        <w:ind w:left="432" w:hanging="360"/>
       </w:pPr>
       <w:rPr>
         <w:rFonts w:ascii="OpenSymbol" w:hAnsi="OpenSymbol" w:cs="OpenSymbol" w:hint="default"/>
@@ -914,12 +925,12 @@
       <w:start w:val="1"/>
       <w:numFmt w:val="bullet"/>
       <w:lvlText w:val=""/>
-      <w:lvlJc w:val="start"/>
+      <w:lvlJc w:val="left"/>
       <w:pPr>
         <w:tabs>
           <w:tab w:val="num" w:pos="1080"/>
         </w:tabs>
-        <w:ind w:start="1080" w:hanging="360"/>
+        <w:ind w:left="1080" w:hanging="360"/>
       </w:pPr>
       <w:rPr>
         <w:rFonts w:ascii="Symbol" w:hAnsi="Symbol" w:cs="Symbol" w:hint="default"/>
@@ -929,12 +940,12 @@
       <w:start w:val="1"/>
       <w:numFmt w:val="bullet"/>
       <w:lvlText w:val=""/>
-      <w:lvlJc w:val="start"/>
+      <w:lvlJc w:val="left"/>
       <w:pPr>
         <w:tabs>
           <w:tab w:val="num" w:pos="1440"/>
         </w:tabs>
-        <w:ind w:start="1440" w:hanging="360"/>
+        <w:ind w:left="1440" w:hanging="360"/>
       </w:pPr>
       <w:rPr>
         <w:rFonts w:ascii="Symbol" w:hAnsi="Symbol" w:cs="Symbol" w:hint="default"/>
@@ -944,12 +955,12 @@
       <w:start w:val="1"/>
       <w:numFmt w:val="bullet"/>
       <w:lvlText w:val=""/>
-      <w:lvlJc w:val="start"/>
+      <w:lvlJc w:val="left"/>
       <w:pPr>
         <w:tabs>
           <w:tab w:val="num" w:pos="1800"/>
         </w:tabs>
-        <w:ind w:start="1800" w:hanging="360"/>
+        <w:ind w:left="1800" w:hanging="360"/>
       </w:pPr>
       <w:rPr>
         <w:rFonts w:ascii="Symbol" w:hAnsi="Symbol" w:cs="Symbol" w:hint="default"/>
@@ -959,12 +970,12 @@
       <w:start w:val="1"/>
       <w:numFmt w:val="bullet"/>
       <w:lvlText w:val=""/>
-      <w:lvlJc w:val="start"/>
+      <w:lvlJc w:val="left"/>
       <w:pPr>
         <w:tabs>
           <w:tab w:val="num" w:pos="2160"/>
         </w:tabs>
-        <w:ind w:start="2160" w:hanging="360"/>
+        <w:ind w:left="2160" w:hanging="360"/>
       </w:pPr>
       <w:rPr>
         <w:rFonts w:ascii="Symbol" w:hAnsi="Symbol" w:cs="Symbol" w:hint="default"/>
@@ -974,12 +985,12 @@
       <w:start w:val="1"/>
       <w:numFmt w:val="bullet"/>
       <w:lvlText w:val=""/>
-      <w:lvlJc w:val="start"/>
+      <w:lvlJc w:val="left"/>
       <w:pPr>
         <w:tabs>
           <w:tab w:val="num" w:pos="2520"/>
         </w:tabs>
-        <w:ind w:start="2520" w:hanging="360"/>
+        <w:ind w:left="2520" w:hanging="360"/>
       </w:pPr>
       <w:rPr>
         <w:rFonts w:ascii="Symbol" w:hAnsi="Symbol" w:cs="Symbol" w:hint="default"/>
@@ -989,12 +1000,12 @@
       <w:start w:val="1"/>
       <w:numFmt w:val="bullet"/>
       <w:lvlText w:val=""/>
-      <w:lvlJc w:val="start"/>
+      <w:lvlJc w:val="left"/>
       <w:pPr>
         <w:tabs>
           <w:tab w:val="num" w:pos="2880"/>
         </w:tabs>
-        <w:ind w:start="2880" w:hanging="360"/>
+        <w:ind w:left="2880" w:hanging="360"/>
       </w:pPr>
       <w:rPr>
         <w:rFonts w:ascii="Symbol" w:hAnsi="Symbol" w:cs="Symbol" w:hint="default"/>
@@ -1004,12 +1015,12 @@
       <w:start w:val="1"/>
       <w:numFmt w:val="bullet"/>
       <w:lvlText w:val=""/>
-      <w:lvlJc w:val="start"/>
+      <w:lvlJc w:val="left"/>
       <w:pPr>
         <w:tabs>
           <w:tab w:val="num" w:pos="3240"/>
         </w:tabs>
-        <w:ind w:start="3240" w:hanging="360"/>
+        <w:ind w:left="3240" w:hanging="360"/>
       </w:pPr>
       <w:rPr>
         <w:rFonts w:ascii="Symbol" w:hAnsi="Symbol" w:cs="Symbol" w:hint="default"/>
@@ -1019,12 +1030,12 @@
       <w:start w:val="1"/>
       <w:numFmt w:val="bullet"/>
       <w:lvlText w:val=""/>
-      <w:lvlJc w:val="start"/>
+      <w:lvlJc w:val="left"/>
       <w:pPr>
         <w:tabs>
           <w:tab w:val="num" w:pos="3600"/>
         </w:tabs>
-        <w:ind w:start="3600" w:hanging="360"/>
+        <w:ind w:left="3600" w:hanging="360"/>
       </w:pPr>
       <w:rPr>
         <w:rFonts w:ascii="Symbol" w:hAnsi="Symbol" w:cs="Symbol" w:hint="default"/>
@@ -1037,12 +1048,12 @@
       <w:numFmt w:val="none"/>
       <w:suff w:val="nothing"/>
       <w:lvlText w:val=""/>
-      <w:lvlJc w:val="start"/>
+      <w:lvlJc w:val="left"/>
       <w:pPr>
         <w:tabs>
           <w:tab w:val="num" w:pos="0"/>
         </w:tabs>
-        <w:ind w:start="0" w:hanging="0"/>
+        <w:ind w:left="0" w:hanging="0"/>
       </w:pPr>
     </w:lvl>
     <w:lvl w:ilvl="1">
@@ -1050,12 +1061,12 @@
       <w:numFmt w:val="none"/>
       <w:suff w:val="nothing"/>
       <w:lvlText w:val=""/>
-      <w:lvlJc w:val="start"/>
+      <w:lvlJc w:val="left"/>
       <w:pPr>
         <w:tabs>
           <w:tab w:val="num" w:pos="0"/>
         </w:tabs>
-        <w:ind w:start="0" w:hanging="0"/>
+        <w:ind w:left="0" w:hanging="0"/>
       </w:pPr>
     </w:lvl>
     <w:lvl w:ilvl="2">
@@ -1063,12 +1074,12 @@
       <w:numFmt w:val="none"/>
       <w:suff w:val="nothing"/>
       <w:lvlText w:val=""/>
-      <w:lvlJc w:val="start"/>
+      <w:lvlJc w:val="left"/>
       <w:pPr>
         <w:tabs>
           <w:tab w:val="num" w:pos="0"/>
         </w:tabs>
-        <w:ind w:start="0" w:hanging="0"/>
+        <w:ind w:left="0" w:hanging="0"/>
       </w:pPr>
     </w:lvl>
     <w:lvl w:ilvl="3">
@@ -1076,12 +1087,12 @@
       <w:numFmt w:val="none"/>
       <w:suff w:val="nothing"/>
       <w:lvlText w:val=""/>
-      <w:lvlJc w:val="start"/>
+      <w:lvlJc w:val="left"/>
       <w:pPr>
         <w:tabs>
           <w:tab w:val="num" w:pos="0"/>
         </w:tabs>
-        <w:ind w:start="0" w:hanging="0"/>
+        <w:ind w:left="0" w:hanging="0"/>
       </w:pPr>
     </w:lvl>
     <w:lvl w:ilvl="4">
@@ -1089,12 +1100,12 @@
       <w:numFmt w:val="none"/>
       <w:suff w:val="nothing"/>
       <w:lvlText w:val=""/>
-      <w:lvlJc w:val="start"/>
+      <w:lvlJc w:val="left"/>
       <w:pPr>
         <w:tabs>
           <w:tab w:val="num" w:pos="0"/>
         </w:tabs>
-        <w:ind w:start="0" w:hanging="0"/>
+        <w:ind w:left="0" w:hanging="0"/>
       </w:pPr>
     </w:lvl>
     <w:lvl w:ilvl="5">
@@ -1102,12 +1113,12 @@
       <w:numFmt w:val="none"/>
       <w:suff w:val="nothing"/>
       <w:lvlText w:val=""/>
-      <w:lvlJc w:val="start"/>
+      <w:lvlJc w:val="left"/>
       <w:pPr>
         <w:tabs>
           <w:tab w:val="num" w:pos="0"/>
         </w:tabs>
-        <w:ind w:start="0" w:hanging="0"/>
+        <w:ind w:left="0" w:hanging="0"/>
       </w:pPr>
     </w:lvl>
     <w:lvl w:ilvl="6">
@@ -1115,12 +1126,12 @@
       <w:numFmt w:val="none"/>
       <w:suff w:val="nothing"/>
       <w:lvlText w:val=""/>
-      <w:lvlJc w:val="start"/>
+      <w:lvlJc w:val="left"/>
       <w:pPr>
         <w:tabs>
           <w:tab w:val="num" w:pos="0"/>
         </w:tabs>
-        <w:ind w:start="0" w:hanging="0"/>
+        <w:ind w:left="0" w:hanging="0"/>
       </w:pPr>
     </w:lvl>
     <w:lvl w:ilvl="7">
@@ -1128,12 +1139,12 @@
       <w:numFmt w:val="none"/>
       <w:suff w:val="nothing"/>
       <w:lvlText w:val=""/>
-      <w:lvlJc w:val="start"/>
+      <w:lvlJc w:val="left"/>
       <w:pPr>
         <w:tabs>
           <w:tab w:val="num" w:pos="0"/>
         </w:tabs>
-        <w:ind w:start="0" w:hanging="0"/>
+        <w:ind w:left="0" w:hanging="0"/>
       </w:pPr>
     </w:lvl>
     <w:lvl w:ilvl="8">
@@ -1141,12 +1152,12 @@
       <w:numFmt w:val="none"/>
       <w:suff w:val="nothing"/>
       <w:lvlText w:val=""/>
-      <w:lvlJc w:val="start"/>
+      <w:lvlJc w:val="left"/>
       <w:pPr>
         <w:tabs>
           <w:tab w:val="num" w:pos="0"/>
         </w:tabs>
-        <w:ind w:start="0" w:hanging="0"/>
+        <w:ind w:left="0" w:hanging="0"/>
       </w:pPr>
     </w:lvl>
   </w:abstractNum>
@@ -1185,7 +1196,7 @@
       <w:suppressAutoHyphens w:val="true"/>
       <w:bidi w:val="0"/>
       <w:spacing w:before="0" w:after="0"/>
-      <w:jc w:val="start"/>
+      <w:jc w:val="left"/>
     </w:pPr>
     <w:rPr>
       <w:rFonts w:ascii="Liberation Serif" w:hAnsi="Liberation Serif" w:eastAsia="NSimSun" w:cs="Arial"/>

</xml_diff>